<commit_message>
fix: resolve compilation issues and deploy to VPS
</commit_message>
<xml_diff>
--- a/scratch/test_trimestral.docx
+++ b/scratch/test_trimestral.docx
@@ -37,7 +37,7 @@
           <w:szCs w:val="24"/>
           <w:rtl w:val="0"/>
         </w:rPr>
-        <w:t xml:space="preserve">22 de Junio del 2026</w:t>
+        <w:t xml:space="preserve">23 de Junio del 2026</w:t>
       </w:r>
       <w:r>
         <w:rPr>
@@ -221,7 +221,7 @@
           <w:szCs w:val="24"/>
           <w:rtl w:val="0"/>
         </w:rPr>
-        <w:t xml:space="preserve">Durante este trimestre, Juan Pablo Herrera ha mostrado un avance significativo hacia sus metas personales. Aunque no ha tenido la oportunidad de estar en la playa, ha disfrutado de actividades al aire libre que le permiten sentir el viento, como las caminatas matutinas con el grupo Artesanos. Estas experiencias le han brindado momentos de disfrute y conexión con la naturaleza, acercándolo a su sueño de estar en la playa. Además, ha participado en salidas con su familia y amigos, donde ha podido disfrutar de su comida favorita, lo que ha contribuido a su satisfacción personal y bienestar emocional.</w:t>
+        <w:t xml:space="preserve">Durante este trimestre, Juan Pablo Herrera ha mostrado un avance significativo hacia sus metas personales. Aunque no ha estado físicamente en la playa, ha disfrutado de actividades al aire libre que le han permitido experimentar sensaciones similares, como el viento en su rostro durante las caminatas grupales. Además, ha tenido la oportunidad de compartir momentos especiales con su familia y amigos, disfrutando de comidas que le son agradables, lo que ha contribuido a su bienestar emocional y social.</w:t>
       </w:r>
     </w:p>
     <w:p>
@@ -250,7 +250,7 @@
           <w:szCs w:val="24"/>
           <w:rtl w:val="0"/>
         </w:rPr>
-        <w:t xml:space="preserve"> La asistencia de Juan Pablo ha sido regular, con algunas inasistencias justificadas por motivos de salud. Sin embargo, su participación en los talleres ha sido activa y entusiasta. Ha demostrado una gran predisposición para involucrarse en las actividades, especialmente en aquellas relacionadas con el deporte y la motricidad fina. Los facilitadores han brindado apoyo físico y verbal cuando ha sido necesario, lo que ha permitido a Juan Pablo sostener su participación y disfrutar de las propuestas de manera significativa.</w:t>
+        <w:t xml:space="preserve"> La asistencia de Juan Pablo ha sido regular, con algunas inasistencias justificadas por motivos de salud. Sin embargo, su participación en los talleres ha sido activa y entusiasta. Ha demostrado una gran predisposición para involucrarse en las actividades, especialmente en aquellas relacionadas con el deporte y la motricidad fina. Los facilitadores han brindado apoyo físico y verbal cuando ha sido necesario, lo que ha permitido a Juan Pablo mantener un nivel de participación constante y positivo.</w:t>
       </w:r>
     </w:p>
     <w:p>
@@ -293,7 +293,7 @@
           <w:szCs w:val="24"/>
           <w:rtl w:val="0"/>
         </w:rPr>
-        <w:t xml:space="preserve"> Juan Pablo mantiene un vínculo positivo con sus compañeros y facilitadores. Se muestra afectuoso y utiliza el contacto físico y gestual para expresar su cariño. Ha desarrollado una relación de confianza con sus facilitadoras, a quienes reconoce como figuras de referencia. Aunque se trabaja en fortalecer su relación con su compañero Rafael, Juan Pablo ha demostrado facilidad para establecer lazos con otros jóvenes, compartiendo espacios de manera adecuada y sin dificultades.</w:t>
+        <w:t xml:space="preserve"> Juan Pablo mantiene un vínculo afectuoso y de confianza con sus compañeros y facilitadores. Se comunica principalmente a través del contacto físico y gestual, mostrando cariño y reconocimiento hacia quienes lo rodean. Aunque se trabaja en fortalecer su relación con su compañero Rafael, Juan Pablo ha demostrado facilidad para establecer lazos con otros jóvenes, participando activamente en actividades grupales y celebraciones, lo que ha fortalecido sus relaciones interpersonales.</w:t>
       </w:r>
     </w:p>
     <w:p>
@@ -322,7 +322,7 @@
           <w:szCs w:val="24"/>
           <w:rtl w:val="0"/>
         </w:rPr>
-        <w:t xml:space="preserve"> Juan Pablo ha participado en diversos talleres que se alinean con sus metas personales, destacándose en deportes y habilidades sociales. Su interés por las actividades físicas es notable, especialmente en circuitos y caminatas, donde ha mostrado un buen desempeño y disfrute. En el taller de Manos Verdes, ha demostrado compromiso y autonomía, lo que le ha permitido disfrutar del contacto con la naturaleza y fortalecer sus habilidades sociales al interactuar con otros jóvenes.</w:t>
+        <w:t xml:space="preserve"> Juan Pablo ha participado en una variedad de talleres que se alinean con sus metas personales, destacándose en deportes y habilidades sociales. Su interés por las actividades físicas, como los circuitos y las caminatas, ha sido notable, y ha logrado avances significativos en su coordinación motriz. Además, en el taller de Manos Verdes, ha mostrado un gran compromiso y disfrute, lo que ha contribuido a su desarrollo personal y social.</w:t>
       </w:r>
     </w:p>
     <w:p>
@@ -351,7 +351,7 @@
           <w:szCs w:val="24"/>
           <w:rtl w:val="0"/>
         </w:rPr>
-        <w:t xml:space="preserve"> A lo largo del trimestre, Juan Pablo ha trabajado en el desarrollo de habilidades cotidianas que favorecen su independencia. Ha colaborado activamente en tareas como poner manteles, acomodar mesas y encender o apagar luces. Estas acciones, realizadas de manera espontánea, reflejan su creciente autonomía y familiarización con su entorno. Además, ha participado en la recolección de elementos en el comedor, lo que fomenta su colaboración y trabajo en equipo.</w:t>
+        <w:t xml:space="preserve"> En cuanto a las habilidades cotidianas, Juan Pablo ha trabajado en acciones que favorecen su autonomía, como colaborar en la preparación de la mesa, encender y apagar luces, y participar en la limpieza de espacios comunes. Estas actividades han sido fundamentales para fortalecer su independencia y su capacidad para realizar tareas diarias de manera más autónoma.</w:t>
       </w:r>
     </w:p>
     <w:p>
@@ -380,7 +380,7 @@
           <w:szCs w:val="24"/>
           <w:rtl w:val="0"/>
         </w:rPr>
-        <w:t xml:space="preserve"> En el taller de Manos Verdes, Juan Pablo ha demostrado adaptabilidad y paciencia al participar en tareas como el traslado de macetas y el uso de la pala de mano. Estas actividades no solo fortalecen su contacto con la naturaleza, sino que también promueven su capacidad de adaptación a nuevos espacios y situaciones. Su participación activa y comprometida en este taller ha sido un reflejo de su interés por el entorno natural y su disposición para aprender y colaborar.</w:t>
+        <w:t xml:space="preserve"> El taller de Manos Verdes ha sido un espacio clave para que Juan Pablo desarrolle habilidades relacionadas con la adaptabilidad y la paciencia. Ha participado activamente en el traslado de macetas y herramientas, y en la manipulación de tierra y plantas, lo que ha fortalecido su conexión con la naturaleza y su capacidad para adaptarse a nuevos entornos.</w:t>
       </w:r>
     </w:p>
     <w:p>
@@ -409,7 +409,7 @@
           <w:szCs w:val="24"/>
           <w:rtl w:val="0"/>
         </w:rPr>
-        <w:t xml:space="preserve"> Juan Pablo ha mostrado un gran interés y perseverancia en actividades que requieren concentración y motricidad fina, como los juegos de encastres. Aunque las actividades artísticas pueden presentar un desafío, ha sido motivado a participar y ha logrado avances significativos en la manipulación de elementos variados. Su capacidad para sostener estas actividades por períodos prolongados refleja su desarrollo personal y su disposición para enfrentar nuevos retos.</w:t>
+        <w:t xml:space="preserve"> Juan Pablo ha demostrado un gran interés y perseverancia en actividades que requieren concentración y motricidad fina, como los juegos de encastres. Aunque las actividades artísticas pueden presentar un desafío, se le ha motivado a través de la incorporación de elementos sensoriales y táctiles, lo que ha mejorado su enfoque y destreza.</w:t>
       </w:r>
     </w:p>
     <w:p>
@@ -438,7 +438,7 @@
           <w:szCs w:val="24"/>
           <w:rtl w:val="0"/>
         </w:rPr>
-        <w:t xml:space="preserve"> En el ámbito deportivo, Juan Pablo ha trabajado en el desarrollo de destrezas físicas como la fuerza, la resistencia y la coordinación motriz. Ha participado activamente en circuitos, caminatas y juegos como bochas y tejo, mostrando entusiasmo y un buen desempeño. Estas actividades no solo han mejorado su condición física, sino que también han contribuido a su bienestar emocional al permitirle disfrutar del ejercicio y la interacción con sus compañeros.</w:t>
+        <w:t xml:space="preserve"> En el ámbito deportivo, Juan Pablo ha trabajado en el desarrollo de su fuerza y resistencia a través de actividades físicas como caminatas y circuitos. Ha mostrado habilidades destacadas en el lanzamiento de pelotas y en juegos como bochas y tejo, lo que ha contribuido a su bienestar físico y a su disfrute de las actividades grupales.</w:t>
       </w:r>
     </w:p>
     <w:p>
@@ -467,7 +467,7 @@
           <w:szCs w:val="24"/>
           <w:rtl w:val="0"/>
         </w:rPr>
-        <w:t xml:space="preserve"> Juan Pablo ha trabajado en el desarrollo de habilidades sociales, como la comunicación verbal y no verbal, la empatía y la relajación. Ha participado en celebraciones de cumpleaños y otras actividades grupales, donde ha demostrado una actitud positiva y disposición para socializar. Su capacidad para relajarse y disfrutar de estos momentos refleja su crecimiento en el ámbito social y su habilidad para establecer conexiones significativas con los demás.</w:t>
+        <w:t xml:space="preserve"> La comunicación, tanto verbal como no verbal, ha sido un área de enfoque para Juan Pablo. Ha participado en actividades de relajación y celebraciones de cumpleaños, lo que ha fomentado su empatía y su capacidad para interactuar de manera positiva con sus compañeros. Estas experiencias han sido enriquecedoras para su desarrollo social y emocional.</w:t>
       </w:r>
     </w:p>
     <w:p>
@@ -496,7 +496,7 @@
           <w:szCs w:val="24"/>
           <w:rtl w:val="0"/>
         </w:rPr>
-        <w:t xml:space="preserve"> A lo largo del trimestre, se han trabajado diversas dimensiones de calidad de vida, como la autodeterminación, el bienestar físico y emocional, y las relaciones interpersonales. Actividades como las bochas, las caminatas y la musicoterapia han contribuido a mejorar su bienestar general, promoviendo la relajación, la interacción social y el disfrute de la música. Estas experiencias han fortalecido su sentido de pertenencia y su capacidad para disfrutar de la vida cotidiana.</w:t>
+        <w:t xml:space="preserve"> Las dimensiones de calidad de vida de Juan Pablo han sido trabajadas a través de diversas actividades. La autodeterminación se ha promovido mediante la elección de actividades y la participación en decisiones cotidianas. El bienestar físico y emocional se ha fortalecido a través de deportes y relajación, mientras que las relaciones interpersonales se han enriquecido mediante la musicoterapia y las caminatas grupales.</w:t>
       </w:r>
     </w:p>
     <w:p>
@@ -525,7 +525,7 @@
           <w:szCs w:val="24"/>
           <w:rtl w:val="0"/>
         </w:rPr>
-        <w:t xml:space="preserve"> Juan Pablo ha participado en actividades complementarias como música y arte, donde ha seguido instrucciones y colaborado con sus compañeros. Ha mostrado interés en la manipulación de instrumentos musicales y en el uso de pinceles y esponjas en actividades artísticas. Además, ha demostrado disposición para ayudar a compañeros con movilidad reducida, lo que refleja su empatía y capacidad para trabajar en equipo.</w:t>
+        <w:t xml:space="preserve"> Juan Pablo ha participado en actividades complementarias como música y arte, donde ha seguido instrucciones y colaborado con compañeros. Ha mostrado interés en la manipulación de instrumentos musicales y en el uso de pinceles y esponjas en actividades artísticas, lo que ha enriquecido su experiencia sensorial y su capacidad para trabajar en equipo.</w:t>
       </w:r>
     </w:p>
     <w:p>
@@ -554,7 +554,7 @@
           <w:szCs w:val="24"/>
           <w:rtl w:val="0"/>
         </w:rPr>
-        <w:t xml:space="preserve"> La incorporación de rutinas, la estimulación sensorial y el contacto con la naturaleza han mejorado significativamente el bienestar general y la salud de Juan Pablo. Estas experiencias han promovido su autonomía, su capacidad de relajación y su disfrute de la vida cotidiana. A través de la participación en diversas actividades, ha logrado un equilibrio entre el desarrollo personal y social, lo que ha contribuido a su calidad de vida y satisfacción personal.</w:t>
+        <w:t xml:space="preserve"> La incorporación de rutinas diarias, la estimulación sensorial a través de la naturaleza y las actividades de relajación han mejorado significativamente el bienestar general de Juan Pablo. Estas experiencias han contribuido a su salud emocional y física, promoviendo un entorno más equilibrado y satisfactorio para su desarrollo personal.</w:t>
       </w:r>
     </w:p>
     <w:p>

</xml_diff>

<commit_message>
feat: fix PDF margins, dynamic years in DOCX, present tense quarterly reports and flexible Excel PCP parser
</commit_message>
<xml_diff>
--- a/scratch/test_trimestral.docx
+++ b/scratch/test_trimestral.docx
@@ -37,7 +37,7 @@
           <w:szCs w:val="24"/>
           <w:rtl w:val="0"/>
         </w:rPr>
-        <w:t xml:space="preserve">23 de Junio del 2026</w:t>
+        <w:t xml:space="preserve">24 de Junio del 2026</w:t>
       </w:r>
       <w:r>
         <w:rPr>
@@ -184,7 +184,7 @@
           <w:szCs w:val="24"/>
           <w:rtl w:val="0"/>
         </w:rPr>
-        <w:t xml:space="preserve">Meta o Sueño para 2024:</w:t>
+        <w:t xml:space="preserve">Meta o Sueño para undefined:</w:t>
       </w:r>
       <w:r>
         <w:rPr>
@@ -212,16 +212,16 @@
           <w:szCs w:val="24"/>
           <w:rtl w:val="0"/>
         </w:rPr>
-        <w:t xml:space="preserve">¿Ha alcanzado su meta o sueño 2024?</w:t>
-        <w:br w:type="textWrapping"/>
-      </w:r>
-      <w:r>
-        <w:rPr>
-          <w:sz w:val="24"/>
-          <w:szCs w:val="24"/>
-          <w:rtl w:val="0"/>
-        </w:rPr>
-        <w:t xml:space="preserve">Durante este trimestre, Juan Pablo Herrera ha mostrado un avance significativo hacia sus metas personales. Aunque no ha estado físicamente en la playa, ha disfrutado de actividades al aire libre que le han permitido experimentar sensaciones similares, como el viento en su rostro durante las caminatas grupales. Además, ha tenido la oportunidad de compartir momentos especiales con su familia y amigos, disfrutando de comidas que le son agradables, lo que ha contribuido a su bienestar emocional y social.</w:t>
+        <w:t xml:space="preserve">¿Ha alcanzado su meta o sueño undefined?</w:t>
+        <w:br w:type="textWrapping"/>
+      </w:r>
+      <w:r>
+        <w:rPr>
+          <w:sz w:val="24"/>
+          <w:szCs w:val="24"/>
+          <w:rtl w:val="0"/>
+        </w:rPr>
+        <w:t xml:space="preserve">Juan Pablo Herrera avanza significativamente hacia su meta de disfrutar de la playa y el viento, así como de compartir comidas favoritas con su familia y amigos. Durante el trimestre, se observa cómo las actividades al aire libre, como las caminatas y el taller de Manos Verdes, le permiten experimentar sensaciones similares a las que busca en la playa. Su disfrute es evidente cuando participa en estas actividades, mostrando una sonrisa constante y una actitud relajada, lo que sugiere que está cada vez más cerca de alcanzar su sueño de disfrutar plenamente de esos momentos especiales en la playa.</w:t>
       </w:r>
     </w:p>
     <w:p>
@@ -241,16 +241,16 @@
           <w:szCs w:val="24"/>
           <w:rtl w:val="0"/>
         </w:rPr>
-        <w:t xml:space="preserve">Participación durante este periodo de 2025</w:t>
-        <w:br w:type="textWrapping"/>
-      </w:r>
-      <w:r>
-        <w:rPr>
-          <w:sz w:val="24"/>
-          <w:szCs w:val="24"/>
-          <w:rtl w:val="0"/>
-        </w:rPr>
-        <w:t xml:space="preserve"> La asistencia de Juan Pablo ha sido regular, con algunas inasistencias justificadas por motivos de salud. Sin embargo, su participación en los talleres ha sido activa y entusiasta. Ha demostrado una gran predisposición para involucrarse en las actividades, especialmente en aquellas relacionadas con el deporte y la motricidad fina. Los facilitadores han brindado apoyo físico y verbal cuando ha sido necesario, lo que ha permitido a Juan Pablo mantener un nivel de participación constante y positivo.</w:t>
+        <w:t xml:space="preserve">Participación durante este periodo de undefined</w:t>
+        <w:br w:type="textWrapping"/>
+      </w:r>
+      <w:r>
+        <w:rPr>
+          <w:sz w:val="24"/>
+          <w:szCs w:val="24"/>
+          <w:rtl w:val="0"/>
+        </w:rPr>
+        <w:t xml:space="preserve"> La asistencia de Juan Pablo a los talleres es regular, y su participación es activa y entusiasta. En cada sesión, los facilitadores le brindan apoyo físico y verbal, lo que le permite involucrarse plenamente en las actividades. Su predisposición es notable, ya que se muestra siempre dispuesto a colaborar y aprender, especialmente en los talleres de deportes y habilidades sociales, donde su interés y energía son palpables. Esta actitud positiva contribuye a un ambiente de aprendizaje enriquecedor tanto para él como para sus compañeros.</w:t>
       </w:r>
     </w:p>
     <w:p>
@@ -293,7 +293,7 @@
           <w:szCs w:val="24"/>
           <w:rtl w:val="0"/>
         </w:rPr>
-        <w:t xml:space="preserve"> Juan Pablo mantiene un vínculo afectuoso y de confianza con sus compañeros y facilitadores. Se comunica principalmente a través del contacto físico y gestual, mostrando cariño y reconocimiento hacia quienes lo rodean. Aunque se trabaja en fortalecer su relación con su compañero Rafael, Juan Pablo ha demostrado facilidad para establecer lazos con otros jóvenes, participando activamente en actividades grupales y celebraciones, lo que ha fortalecido sus relaciones interpersonales.</w:t>
+        <w:t xml:space="preserve"> Juan Pablo mantiene una relación afectuosa y de confianza con sus compañeros y facilitadores. Su interacción se caracteriza por el contacto físico y gestual, como abrazos y sonrisas, que reflejan su cariño y aprecio. Con sus facilitadoras, el vínculo es sólido; las reconoce como figuras de autoridad y muestra respeto y afecto hacia ellas. Aunque trabaja en fortalecer su relación con su compañero Rafael, su capacidad para establecer lazos con otros jóvenes es evidente, lo que enriquece su experiencia social y emocional.</w:t>
       </w:r>
     </w:p>
     <w:p>
@@ -322,7 +322,7 @@
           <w:szCs w:val="24"/>
           <w:rtl w:val="0"/>
         </w:rPr>
-        <w:t xml:space="preserve"> Juan Pablo ha participado en una variedad de talleres que se alinean con sus metas personales, destacándose en deportes y habilidades sociales. Su interés por las actividades físicas, como los circuitos y las caminatas, ha sido notable, y ha logrado avances significativos en su coordinación motriz. Además, en el taller de Manos Verdes, ha mostrado un gran compromiso y disfrute, lo que ha contribuido a su desarrollo personal y social.</w:t>
+        <w:t xml:space="preserve"> En los talleres de deportes y habilidades sociales, Juan Pablo demuestra un interés particular y logra avances significativos. Su participación en actividades físicas, como circuitos y juegos de bochas, le permite desarrollar habilidades motoras y sociales. Además, en el taller de Manos Verdes, su entusiasmo por las tareas de jardinería refleja su conexión con la naturaleza y su deseo de aprender y colaborar. Estas actividades no solo están alineadas con sus metas personales, sino que también fomentan su desarrollo integral.</w:t>
       </w:r>
     </w:p>
     <w:p>
@@ -351,7 +351,7 @@
           <w:szCs w:val="24"/>
           <w:rtl w:val="0"/>
         </w:rPr>
-        <w:t xml:space="preserve"> En cuanto a las habilidades cotidianas, Juan Pablo ha trabajado en acciones que favorecen su autonomía, como colaborar en la preparación de la mesa, encender y apagar luces, y participar en la limpieza de espacios comunes. Estas actividades han sido fundamentales para fortalecer su independencia y su capacidad para realizar tareas diarias de manera más autónoma.</w:t>
+        <w:t xml:space="preserve"> Juan Pablo trabaja constantemente en mejorar sus habilidades cotidianas, como colaborar en la preparación de la mesa, encender y apagar luces, y participar en la limpieza de espacios comunes. Estas tareas, que realiza con creciente autonomía, son fundamentales para su vida diaria y reflejan su compromiso con el desarrollo de su independencia. Su capacidad para seguir rutinas y asumir responsabilidades en el hogar y en la institución es un indicador positivo de su progreso hacia una vida más autónoma.</w:t>
       </w:r>
     </w:p>
     <w:p>
@@ -380,7 +380,7 @@
           <w:szCs w:val="24"/>
           <w:rtl w:val="0"/>
         </w:rPr>
-        <w:t xml:space="preserve"> El taller de Manos Verdes ha sido un espacio clave para que Juan Pablo desarrolle habilidades relacionadas con la adaptabilidad y la paciencia. Ha participado activamente en el traslado de macetas y herramientas, y en la manipulación de tierra y plantas, lo que ha fortalecido su conexión con la naturaleza y su capacidad para adaptarse a nuevos entornos.</w:t>
+        <w:t xml:space="preserve"> En el taller de Manos Verdes, Juan Pablo se adapta a nuevos espacios y tareas, lo que fortalece su paciencia y contacto con la naturaleza. Su habilidad para manejar herramientas como la pala de mano y colaborar en el traslado de plantas demuestra su capacidad de adaptación y su disposición para aprender. Estas experiencias enriquecen su comprensión del entorno natural y fomentan su desarrollo personal, preparándolo para futuras experiencias de viaje y exploración.</w:t>
       </w:r>
     </w:p>
     <w:p>
@@ -409,7 +409,7 @@
           <w:szCs w:val="24"/>
           <w:rtl w:val="0"/>
         </w:rPr>
-        <w:t xml:space="preserve"> Juan Pablo ha demostrado un gran interés y perseverancia en actividades que requieren concentración y motricidad fina, como los juegos de encastres. Aunque las actividades artísticas pueden presentar un desafío, se le ha motivado a través de la incorporación de elementos sensoriales y táctiles, lo que ha mejorado su enfoque y destreza.</w:t>
+        <w:t xml:space="preserve"> Juan Pablo participa activamente en tareas grupales y juegos de encastres, mostrando una notable concentración y perseverancia. Aunque las actividades artísticas pueden presentar un desafío, se le motiva a través de la música y el juego, lo que le ayuda a mejorar su motricidad fina. Su capacidad para manipular diferentes materiales y su interés en actividades creativas son testimonio de su crecimiento personal y su deseo de superar obstáculos.</w:t>
       </w:r>
     </w:p>
     <w:p>
@@ -438,7 +438,7 @@
           <w:szCs w:val="24"/>
           <w:rtl w:val="0"/>
         </w:rPr>
-        <w:t xml:space="preserve"> En el ámbito deportivo, Juan Pablo ha trabajado en el desarrollo de su fuerza y resistencia a través de actividades físicas como caminatas y circuitos. Ha mostrado habilidades destacadas en el lanzamiento de pelotas y en juegos como bochas y tejo, lo que ha contribuido a su bienestar físico y a su disfrute de las actividades grupales.</w:t>
+        <w:t xml:space="preserve"> Las destrezas físicas de Juan Pablo se desarrollan a través de actividades como caminatas, lanzamiento de pelotas y juegos de bochas. Su fuerza y resistencia mejoran con cada sesión, y su entusiasmo por los deportes es evidente. Participa activamente en ejercicios de movilidad articular y coordinación, lo que no solo mejora su condición física, sino que también le proporciona una sensación de logro y satisfacción personal.</w:t>
       </w:r>
     </w:p>
     <w:p>
@@ -467,7 +467,7 @@
           <w:szCs w:val="24"/>
           <w:rtl w:val="0"/>
         </w:rPr>
-        <w:t xml:space="preserve"> La comunicación, tanto verbal como no verbal, ha sido un área de enfoque para Juan Pablo. Ha participado en actividades de relajación y celebraciones de cumpleaños, lo que ha fomentado su empatía y su capacidad para interactuar de manera positiva con sus compañeros. Estas experiencias han sido enriquecedoras para su desarrollo social y emocional.</w:t>
+        <w:t xml:space="preserve"> Juan Pablo trabaja en su comunicación verbal y no verbal, mostrando empatía y disposición para interactuar con sus compañeros. Las sesiones de relajación y las celebraciones de cumpleaños son oportunidades para que desarrolle sus habilidades sociales en un ambiente seguro y acogedor. Su capacidad para disfrutar de estos momentos y su participación activa en eventos grupales reflejan su crecimiento en el ámbito social y emocional.</w:t>
       </w:r>
     </w:p>
     <w:p>
@@ -496,7 +496,7 @@
           <w:szCs w:val="24"/>
           <w:rtl w:val="0"/>
         </w:rPr>
-        <w:t xml:space="preserve"> Las dimensiones de calidad de vida de Juan Pablo han sido trabajadas a través de diversas actividades. La autodeterminación se ha promovido mediante la elección de actividades y la participación en decisiones cotidianas. El bienestar físico y emocional se ha fortalecido a través de deportes y relajación, mientras que las relaciones interpersonales se han enriquecido mediante la musicoterapia y las caminatas grupales.</w:t>
+        <w:t xml:space="preserve"> Las dimensiones de calidad de vida de Juan Pablo, como la autodeterminación, el bienestar físico y emocional, y las relaciones interpersonales, se trabajan a través de actividades como bochas, caminatas, relajación y musicoterapia. Estas experiencias le permiten desarrollar un sentido de autonomía y bienestar, al tiempo que fortalecen sus vínculos sociales y su capacidad para disfrutar de la vida de manera plena y significativa.</w:t>
       </w:r>
     </w:p>
     <w:p>
@@ -525,7 +525,7 @@
           <w:szCs w:val="24"/>
           <w:rtl w:val="0"/>
         </w:rPr>
-        <w:t xml:space="preserve"> Juan Pablo ha participado en actividades complementarias como música y arte, donde ha seguido instrucciones y colaborado con compañeros. Ha mostrado interés en la manipulación de instrumentos musicales y en el uso de pinceles y esponjas en actividades artísticas, lo que ha enriquecido su experiencia sensorial y su capacidad para trabajar en equipo.</w:t>
+        <w:t xml:space="preserve"> Juan Pablo participa en actividades complementarias como música y arte, donde sigue instrucciones y colabora con compañeros. Su interés por la música se manifiesta en su capacidad para manipular instrumentos y disfrutar de la actividad. En el ámbito artístico, utiliza pinceles y esponjas para expresarse creativamente. Además, su disposición para ayudar a compañeros con movilidad reducida demuestra su empatía y su deseo de contribuir positivamente al grupo.</w:t>
       </w:r>
     </w:p>
     <w:p>
@@ -554,7 +554,7 @@
           <w:szCs w:val="24"/>
           <w:rtl w:val="0"/>
         </w:rPr>
-        <w:t xml:space="preserve"> La incorporación de rutinas diarias, la estimulación sensorial a través de la naturaleza y las actividades de relajación han mejorado significativamente el bienestar general de Juan Pablo. Estas experiencias han contribuido a su salud emocional y física, promoviendo un entorno más equilibrado y satisfactorio para su desarrollo personal.</w:t>
+        <w:t xml:space="preserve"> La incorporación de rutinas, la estimulación sensorial y el contacto con la naturaleza han mejorado significativamente el bienestar general y la salud de Juan Pablo. Estas experiencias no solo enriquecen su vida diaria, sino que también le proporcionan herramientas para enfrentar desafíos y disfrutar de momentos de tranquilidad y conexión con su entorno. Su progreso es un testimonio de su capacidad para crecer y desarrollarse en un ambiente de apoyo y cuidado.</w:t>
       </w:r>
     </w:p>
     <w:p>

</xml_diff>